<commit_message>
Atualiza correção 1 e remove seção de segurança RLS do plano
https://claude.ai/code/session_01QV8d4yT7wUXju8L84Xs7y2
</commit_message>
<xml_diff>
--- a/Plano_Correcoes_Clara_Final.docx
+++ b/Plano_Correcoes_Clara_Final.docx
@@ -125,7 +125,7 @@
           <w:b w:val="0"/>
           <w:i w:val="0"/>
         </w:rPr>
-        <w:t>O fluxo deve mostrar o aviso de sinais de alarme ANTES de perguntar se os sintomas são leves. Numa conversa (paciente Aline, 12:53), esse aviso não apareceu — a Clara pulou direto para "confirma que seus sintomas são LEVES? SIM/NÃO". A paciente confirmou "Sim", depois listou sintomas incluindo "falta de ar ao caminhar", e foi mandada ao SAMU sem o checklist correto. Observação: em outras conversas do mesmo dia o aviso apareceu normalmente — indica que uma alteração no workflow durante o dia quebrou o fluxo para parte dos atendimentos. Confirmar com o Nicolas se houve alteração entre 11h e 12h53 do dia 09/06.</w:t>
+        <w:t>O fluxo deve mostrar o aviso de sinais de alarme ANTES de perguntar os sintomas. Numa conversa (paciente Aline, 12:53), esse aviso não apareceu — a Clara enviou uma mensagem genérica perguntando dos sintomas, sem as orientações devidas, então a paciente listou todos os sintomas que sentia, inclusive falta de ar ao caminhar, que na mensagem original fala que se tiver deve ir para o atendimento presencial, e foi mandada ao SAMU sem o checklist correto. Observação: em outras conversas do mesmo dia o aviso apareceu normalmente — indica que uma alteração no workflow durante o dia quebrou o fluxo para parte dos atendimentos. Confirmar com o Nicolas se houve alteração.</w:t>
       </w:r>
     </w:p>
     <w:p>
@@ -1754,132 +1754,6 @@
         <w:rPr>
           <w:color w:val="C00000"/>
         </w:rPr>
-        <w:t>SEGURANÇA — RLS desativado em 7 tabelas</w:t>
-      </w:r>
-    </w:p>
-    <w:p>
-      <w:r>
-        <w:rPr>
-          <w:b/>
-          <w:i w:val="0"/>
-        </w:rPr>
-        <w:t>Prioridade: CRÍTICA | Onde: banco de dados (Supabase)</w:t>
-      </w:r>
-    </w:p>
-    <w:p>
-      <w:r>
-        <w:rPr>
-          <w:b w:val="0"/>
-          <w:i w:val="0"/>
-        </w:rPr>
-        <w:t>As tabelas abaixo estão completamente abertas — qualquer pessoa com a chave anon pode ler ou modificar todos os dados dos pacientes:</w:t>
-      </w:r>
-    </w:p>
-    <w:p>
-      <w:pPr>
-        <w:pStyle w:val="ListBullet"/>
-      </w:pPr>
-      <w:r>
-        <w:t>dados_cliente (CPFs, endereços, emails, telefones)</w:t>
-      </w:r>
-    </w:p>
-    <w:p>
-      <w:pPr>
-        <w:pStyle w:val="ListBullet"/>
-      </w:pPr>
-      <w:r>
-        <w:t>chat_messages (histórico completo de conversas)</w:t>
-      </w:r>
-    </w:p>
-    <w:p>
-      <w:pPr>
-        <w:pStyle w:val="ListBullet"/>
-      </w:pPr>
-      <w:r>
-        <w:t>chats</w:t>
-      </w:r>
-    </w:p>
-    <w:p>
-      <w:pPr>
-        <w:pStyle w:val="ListBullet"/>
-      </w:pPr>
-      <w:r>
-        <w:t>n8n_chat_histories</w:t>
-      </w:r>
-    </w:p>
-    <w:p>
-      <w:pPr>
-        <w:pStyle w:val="ListBullet"/>
-      </w:pPr>
-      <w:r>
-        <w:t>agendamentos</w:t>
-      </w:r>
-    </w:p>
-    <w:p>
-      <w:pPr>
-        <w:pStyle w:val="ListBullet"/>
-      </w:pPr>
-      <w:r>
-        <w:t>horarios_temp</w:t>
-      </w:r>
-    </w:p>
-    <w:p>
-      <w:pPr>
-        <w:pStyle w:val="ListBullet"/>
-      </w:pPr>
-      <w:r>
-        <w:t>renovacoes</w:t>
-      </w:r>
-    </w:p>
-    <w:p>
-      <w:r>
-        <w:rPr>
-          <w:b/>
-          <w:i w:val="0"/>
-        </w:rPr>
-        <w:t>ATENÇÃO: ativar o RLS sem configurar as policies bloqueia todo o acesso (inclusive o do n8n). Configure as policies antes de ativar, ou faça com acompanhamento técnico.</w:t>
-      </w:r>
-    </w:p>
-    <w:p>
-      <w:pPr>
-        <w:ind w:left="400"/>
-        <w:shd w:val="clear" w:color="auto" w:fill="F2F2F2"/>
-      </w:pPr>
-      <w:r>
-        <w:rPr>
-          <w:rFonts w:ascii="Consolas" w:hAnsi="Consolas"/>
-          <w:sz w:val="18"/>
-        </w:rPr>
-        <w:t>ALTER TABLE public.dados_cliente ENABLE ROW LEVEL SECURITY;</w:t>
-        <w:br/>
-        <w:t>ALTER TABLE public.chat_messages ENABLE ROW LEVEL SECURITY;</w:t>
-        <w:br/>
-        <w:t>ALTER TABLE public.chats ENABLE ROW LEVEL SECURITY;</w:t>
-        <w:br/>
-        <w:t>ALTER TABLE public.n8n_chat_histories ENABLE ROW LEVEL SECURITY;</w:t>
-        <w:br/>
-        <w:t>ALTER TABLE public.agendamentos ENABLE ROW LEVEL SECURITY;</w:t>
-        <w:br/>
-        <w:t>ALTER TABLE public.horarios_temp ENABLE ROW LEVEL SECURITY;</w:t>
-        <w:br/>
-        <w:t>ALTER TABLE public.renovacoes ENABLE ROW LEVEL SECURITY;</w:t>
-      </w:r>
-    </w:p>
-    <w:p>
-      <w:pPr>
-        <w:pBdr>
-          <w:bottom w:val="single" w:sz="6" w:space="1" w:color="AAAAAA"/>
-        </w:pBdr>
-      </w:pPr>
-    </w:p>
-    <w:p>
-      <w:pPr>
-        <w:pStyle w:val="Heading1"/>
-      </w:pPr>
-      <w:r>
-        <w:rPr>
-          <w:color w:val="C00000"/>
-        </w:rPr>
         <w:t>Checklist geral de implementação</w:t>
       </w:r>
     </w:p>

</xml_diff>

<commit_message>
Remove passo do critério de falta de ar da correção 1
https://claude.ai/code/session_01QV8d4yT7wUXju8L84Xs7y2
</commit_message>
<xml_diff>
--- a/Plano_Correcoes_Clara_Final.docx
+++ b/Plano_Correcoes_Clara_Final.docx
@@ -242,41 +242,7 @@
           <w:b/>
           <w:i w:val="0"/>
         </w:rPr>
-        <w:t>Passo 2 — Corrigir o critério de "falta de ar" no prompt:</w:t>
-      </w:r>
-    </w:p>
-    <w:p>
-      <w:pPr>
-        <w:ind w:left="400"/>
-        <w:shd w:val="clear" w:color="auto" w:fill="F2F2F2"/>
-      </w:pPr>
-      <w:r>
-        <w:rPr>
-          <w:rFonts w:ascii="Consolas" w:hAnsi="Consolas"/>
-          <w:sz w:val="18"/>
-        </w:rPr>
-        <w:t>❌ ERRADO: encaminhar ao SAMU por qualquer menção de "falta de ar"</w:t>
-        <w:br/>
-        <w:br/>
-        <w:t>✅ CORRETO: encaminhar ao SAMU apenas se:</w:t>
-        <w:br/>
-        <w:t xml:space="preserve">   → Falta de ar em REPOUSO (sem esforço físico)</w:t>
-        <w:br/>
-        <w:t xml:space="preserve">   → Falta de ar que impede de falar frases completas</w:t>
-        <w:br/>
-        <w:t xml:space="preserve">   → Falta de ar com dor no peito ou lábios azulados</w:t>
-        <w:br/>
-        <w:br/>
-        <w:t xml:space="preserve">   Falta de ar ao caminhar/subir escada = sintoma leve, atende online.</w:t>
-      </w:r>
-    </w:p>
-    <w:p>
-      <w:r>
-        <w:rPr>
-          <w:b/>
-          <w:i w:val="0"/>
-        </w:rPr>
-        <w:t>Passo 3 — Corrigir o bug de acumulação de input:</w:t>
+        <w:t>Passo 2 — Corrigir o bug de acumulação de input:</w:t>
       </w:r>
     </w:p>
     <w:p>
@@ -311,7 +277,7 @@
           <w:b/>
           <w:i w:val="0"/>
         </w:rPr>
-        <w:t>Passo 4 — Deduplicação de mensagens duplicadas (double-delivery):</w:t>
+        <w:t>Passo 3 — Deduplicação de mensagens duplicadas (double-delivery):</w:t>
       </w:r>
     </w:p>
     <w:p>
@@ -329,7 +295,7 @@
           <w:b/>
           <w:i w:val="0"/>
         </w:rPr>
-        <w:t>Passo 5 — Trava de execução por telefone (lock) — resolve as listas duplicadas:</w:t>
+        <w:t>Passo 4 — Trava de execução por telefone (lock) — resolve as listas duplicadas:</w:t>
       </w:r>
     </w:p>
     <w:p>
@@ -1770,14 +1736,6 @@
         <w:pStyle w:val="ListBullet"/>
       </w:pPr>
       <w:r>
-        <w:t>☐  CORREÇÃO 1 — Corrigir critério de "falta de ar" (só emergência em repouso)</w:t>
-      </w:r>
-    </w:p>
-    <w:p>
-      <w:pPr>
-        <w:pStyle w:val="ListBullet"/>
-      </w:pPr>
-      <w:r>
         <w:t>☐  CORREÇÃO 1 — Corrigir expressão do chatInput (só mensagem atual)</w:t>
       </w:r>
     </w:p>

</xml_diff>